<commit_message>
EHIS-5053 [Receipt generation defect changes]
</commit_message>
<xml_diff>
--- a/PHOCS-Docgentemplates/PHOCSReceiptTemplate.docx
+++ b/PHOCS-Docgentemplates/PHOCSReceiptTemplate.docx
@@ -612,7 +612,7 @@
                       <w:sz w:val="22"/>
                       <w:szCs w:val="22"/>
                     </w:rPr>
-                    <w:t>FeeType</w:t>
+                    <w:t>RTFItemFeeType</w:t>
                   </w:r>
                   <w:proofErr w:type="spellEnd"/>
                   <w:r>
@@ -898,8 +898,12 @@
       </w:pPr>
     </w:p>
     <w:sectPr>
-      <w:headerReference w:type="default" r:id="rId11"/>
-      <w:footerReference w:type="default" r:id="rId12"/>
+      <w:headerReference w:type="even" r:id="rId11"/>
+      <w:headerReference w:type="default" r:id="rId12"/>
+      <w:footerReference w:type="even" r:id="rId13"/>
+      <w:footerReference w:type="default" r:id="rId14"/>
+      <w:headerReference w:type="first" r:id="rId15"/>
+      <w:footerReference w:type="first" r:id="rId16"/>
       <w:pgSz w:w="12240" w:h="15840"/>
       <w:pgMar w:top="1440" w:right="1440" w:bottom="1440" w:left="1440" w:header="708" w:footer="708" w:gutter="0"/>
       <w:cols w:space="708"/>
@@ -938,6 +942,16 @@
 <w:ftr xmlns:wpc="http://schemas.microsoft.com/office/word/2010/wordprocessingCanvas" xmlns:cx="http://schemas.microsoft.com/office/drawing/2014/chartex" xmlns:cx1="http://schemas.microsoft.com/office/drawing/2015/9/8/chartex" xmlns:cx2="http://schemas.microsoft.com/office/drawing/2015/10/21/chartex" xmlns:cx3="http://schemas.microsoft.com/office/drawing/2016/5/9/chartex" xmlns:cx4="http://schemas.microsoft.com/office/drawing/2016/5/10/chartex" xmlns:cx5="http://schemas.microsoft.com/office/drawing/2016/5/11/chartex" xmlns:cx6="http://schemas.microsoft.com/office/drawing/2016/5/12/chartex" xmlns:cx7="http://schemas.microsoft.com/office/drawing/2016/5/13/chartex" xmlns:cx8="http://schemas.microsoft.com/office/drawing/2016/5/14/chartex" xmlns:mc="http://schemas.openxmlformats.org/markup-compatibility/2006" xmlns:aink="http://schemas.microsoft.com/office/drawing/2016/ink" xmlns:am3d="http://schemas.microsoft.com/office/drawing/2017/model3d" xmlns:o="urn:schemas-microsoft-com:office:office" xmlns:oel="http://schemas.microsoft.com/office/2019/extlst" xmlns:r="http://schemas.openxmlformats.org/officeDocument/2006/relationships" xmlns:m="http://schemas.openxmlformats.org/officeDocument/2006/math" xmlns:v="urn:schemas-microsoft-com:vml" xmlns:wp14="http://schemas.microsoft.com/office/word/2010/wordprocessingDrawing" xmlns:wp="http://schemas.openxmlformats.org/drawingml/2006/wordprocessingDrawing" xmlns:w10="urn:schemas-microsoft-com:office:word" xmlns:w="http://schemas.openxmlformats.org/wordprocessingml/2006/main" xmlns:w14="http://schemas.microsoft.com/office/word/2010/wordml" xmlns:w15="http://schemas.microsoft.com/office/word/2012/wordml" xmlns:w16cex="http://schemas.microsoft.com/office/word/2018/wordml/cex" xmlns:w16cid="http://schemas.microsoft.com/office/word/2016/wordml/cid" xmlns:w16="http://schemas.microsoft.com/office/word/2018/wordml" xmlns:w16du="http://schemas.microsoft.com/office/word/2023/wordml/word16du" xmlns:w16sdtdh="http://schemas.microsoft.com/office/word/2020/wordml/sdtdatahash" xmlns:w16sdtfl="http://schemas.microsoft.com/office/word/2024/wordml/sdtformatlock" xmlns:w16se="http://schemas.microsoft.com/office/word/2015/wordml/symex" xmlns:wpg="http://schemas.microsoft.com/office/word/2010/wordprocessingGroup" xmlns:wpi="http://schemas.microsoft.com/office/word/2010/wordprocessingInk" xmlns:wne="http://schemas.microsoft.com/office/word/2006/wordml" xmlns:wps="http://schemas.microsoft.com/office/word/2010/wordprocessingShape" mc:Ignorable="w14 w15 w16se w16cid w16 w16cex w16sdtdh w16sdtfl w16du wp14">
   <w:p>
     <w:pPr>
+      <w:pStyle w:val="Footer"/>
+    </w:pPr>
+  </w:p>
+</w:ftr>
+</file>
+
+<file path=word/footer2.xml><?xml version="1.0" encoding="utf-8"?>
+<w:ftr xmlns:wpc="http://schemas.microsoft.com/office/word/2010/wordprocessingCanvas" xmlns:cx="http://schemas.microsoft.com/office/drawing/2014/chartex" xmlns:cx1="http://schemas.microsoft.com/office/drawing/2015/9/8/chartex" xmlns:cx2="http://schemas.microsoft.com/office/drawing/2015/10/21/chartex" xmlns:cx3="http://schemas.microsoft.com/office/drawing/2016/5/9/chartex" xmlns:cx4="http://schemas.microsoft.com/office/drawing/2016/5/10/chartex" xmlns:cx5="http://schemas.microsoft.com/office/drawing/2016/5/11/chartex" xmlns:cx6="http://schemas.microsoft.com/office/drawing/2016/5/12/chartex" xmlns:cx7="http://schemas.microsoft.com/office/drawing/2016/5/13/chartex" xmlns:cx8="http://schemas.microsoft.com/office/drawing/2016/5/14/chartex" xmlns:mc="http://schemas.openxmlformats.org/markup-compatibility/2006" xmlns:aink="http://schemas.microsoft.com/office/drawing/2016/ink" xmlns:am3d="http://schemas.microsoft.com/office/drawing/2017/model3d" xmlns:o="urn:schemas-microsoft-com:office:office" xmlns:oel="http://schemas.microsoft.com/office/2019/extlst" xmlns:r="http://schemas.openxmlformats.org/officeDocument/2006/relationships" xmlns:m="http://schemas.openxmlformats.org/officeDocument/2006/math" xmlns:v="urn:schemas-microsoft-com:vml" xmlns:wp14="http://schemas.microsoft.com/office/word/2010/wordprocessingDrawing" xmlns:wp="http://schemas.openxmlformats.org/drawingml/2006/wordprocessingDrawing" xmlns:w10="urn:schemas-microsoft-com:office:word" xmlns:w="http://schemas.openxmlformats.org/wordprocessingml/2006/main" xmlns:w14="http://schemas.microsoft.com/office/word/2010/wordml" xmlns:w15="http://schemas.microsoft.com/office/word/2012/wordml" xmlns:w16cex="http://schemas.microsoft.com/office/word/2018/wordml/cex" xmlns:w16cid="http://schemas.microsoft.com/office/word/2016/wordml/cid" xmlns:w16="http://schemas.microsoft.com/office/word/2018/wordml" xmlns:w16du="http://schemas.microsoft.com/office/word/2023/wordml/word16du" xmlns:w16sdtdh="http://schemas.microsoft.com/office/word/2020/wordml/sdtdatahash" xmlns:w16sdtfl="http://schemas.microsoft.com/office/word/2024/wordml/sdtformatlock" xmlns:w16se="http://schemas.microsoft.com/office/word/2015/wordml/symex" xmlns:wpg="http://schemas.microsoft.com/office/word/2010/wordprocessingGroup" xmlns:wpi="http://schemas.microsoft.com/office/word/2010/wordprocessingInk" xmlns:wne="http://schemas.microsoft.com/office/word/2006/wordml" xmlns:wps="http://schemas.microsoft.com/office/word/2010/wordprocessingShape" mc:Ignorable="w14 w15 w16se w16cid w16 w16cex w16sdtdh w16sdtfl w16du wp14">
+  <w:p>
+    <w:pPr>
       <w:jc w:val="center"/>
       <w:rPr>
         <w:rFonts w:ascii="BC Sans" w:hAnsi="BC Sans"/>
@@ -963,6 +977,16 @@
       <w:t>NO OTHER RECEPIT WILL BE ISSUED.</w:t>
     </w:r>
   </w:p>
+  <w:p>
+    <w:pPr>
+      <w:pStyle w:val="Footer"/>
+    </w:pPr>
+  </w:p>
+</w:ftr>
+</file>
+
+<file path=word/footer3.xml><?xml version="1.0" encoding="utf-8"?>
+<w:ftr xmlns:wpc="http://schemas.microsoft.com/office/word/2010/wordprocessingCanvas" xmlns:cx="http://schemas.microsoft.com/office/drawing/2014/chartex" xmlns:cx1="http://schemas.microsoft.com/office/drawing/2015/9/8/chartex" xmlns:cx2="http://schemas.microsoft.com/office/drawing/2015/10/21/chartex" xmlns:cx3="http://schemas.microsoft.com/office/drawing/2016/5/9/chartex" xmlns:cx4="http://schemas.microsoft.com/office/drawing/2016/5/10/chartex" xmlns:cx5="http://schemas.microsoft.com/office/drawing/2016/5/11/chartex" xmlns:cx6="http://schemas.microsoft.com/office/drawing/2016/5/12/chartex" xmlns:cx7="http://schemas.microsoft.com/office/drawing/2016/5/13/chartex" xmlns:cx8="http://schemas.microsoft.com/office/drawing/2016/5/14/chartex" xmlns:mc="http://schemas.openxmlformats.org/markup-compatibility/2006" xmlns:aink="http://schemas.microsoft.com/office/drawing/2016/ink" xmlns:am3d="http://schemas.microsoft.com/office/drawing/2017/model3d" xmlns:o="urn:schemas-microsoft-com:office:office" xmlns:oel="http://schemas.microsoft.com/office/2019/extlst" xmlns:r="http://schemas.openxmlformats.org/officeDocument/2006/relationships" xmlns:m="http://schemas.openxmlformats.org/officeDocument/2006/math" xmlns:v="urn:schemas-microsoft-com:vml" xmlns:wp14="http://schemas.microsoft.com/office/word/2010/wordprocessingDrawing" xmlns:wp="http://schemas.openxmlformats.org/drawingml/2006/wordprocessingDrawing" xmlns:w10="urn:schemas-microsoft-com:office:word" xmlns:w="http://schemas.openxmlformats.org/wordprocessingml/2006/main" xmlns:w14="http://schemas.microsoft.com/office/word/2010/wordml" xmlns:w15="http://schemas.microsoft.com/office/word/2012/wordml" xmlns:w16cex="http://schemas.microsoft.com/office/word/2018/wordml/cex" xmlns:w16cid="http://schemas.microsoft.com/office/word/2016/wordml/cid" xmlns:w16="http://schemas.microsoft.com/office/word/2018/wordml" xmlns:w16du="http://schemas.microsoft.com/office/word/2023/wordml/word16du" xmlns:w16sdtdh="http://schemas.microsoft.com/office/word/2020/wordml/sdtdatahash" xmlns:w16sdtfl="http://schemas.microsoft.com/office/word/2024/wordml/sdtformatlock" xmlns:w16se="http://schemas.microsoft.com/office/word/2015/wordml/symex" xmlns:wpg="http://schemas.microsoft.com/office/word/2010/wordprocessingGroup" xmlns:wpi="http://schemas.microsoft.com/office/word/2010/wordprocessingInk" xmlns:wne="http://schemas.microsoft.com/office/word/2006/wordml" xmlns:wps="http://schemas.microsoft.com/office/word/2010/wordprocessingShape" mc:Ignorable="w14 w15 w16se w16cid w16 w16cex w16sdtdh w16sdtfl w16du wp14">
   <w:p>
     <w:pPr>
       <w:pStyle w:val="Footer"/>
@@ -997,6 +1021,16 @@
 </file>
 
 <file path=word/header1.xml><?xml version="1.0" encoding="utf-8"?>
+<w:hdr xmlns:wpc="http://schemas.microsoft.com/office/word/2010/wordprocessingCanvas" xmlns:cx="http://schemas.microsoft.com/office/drawing/2014/chartex" xmlns:cx1="http://schemas.microsoft.com/office/drawing/2015/9/8/chartex" xmlns:cx2="http://schemas.microsoft.com/office/drawing/2015/10/21/chartex" xmlns:cx3="http://schemas.microsoft.com/office/drawing/2016/5/9/chartex" xmlns:cx4="http://schemas.microsoft.com/office/drawing/2016/5/10/chartex" xmlns:cx5="http://schemas.microsoft.com/office/drawing/2016/5/11/chartex" xmlns:cx6="http://schemas.microsoft.com/office/drawing/2016/5/12/chartex" xmlns:cx7="http://schemas.microsoft.com/office/drawing/2016/5/13/chartex" xmlns:cx8="http://schemas.microsoft.com/office/drawing/2016/5/14/chartex" xmlns:mc="http://schemas.openxmlformats.org/markup-compatibility/2006" xmlns:aink="http://schemas.microsoft.com/office/drawing/2016/ink" xmlns:am3d="http://schemas.microsoft.com/office/drawing/2017/model3d" xmlns:o="urn:schemas-microsoft-com:office:office" xmlns:oel="http://schemas.microsoft.com/office/2019/extlst" xmlns:r="http://schemas.openxmlformats.org/officeDocument/2006/relationships" xmlns:m="http://schemas.openxmlformats.org/officeDocument/2006/math" xmlns:v="urn:schemas-microsoft-com:vml" xmlns:wp14="http://schemas.microsoft.com/office/word/2010/wordprocessingDrawing" xmlns:wp="http://schemas.openxmlformats.org/drawingml/2006/wordprocessingDrawing" xmlns:w10="urn:schemas-microsoft-com:office:word" xmlns:w="http://schemas.openxmlformats.org/wordprocessingml/2006/main" xmlns:w14="http://schemas.microsoft.com/office/word/2010/wordml" xmlns:w15="http://schemas.microsoft.com/office/word/2012/wordml" xmlns:w16cex="http://schemas.microsoft.com/office/word/2018/wordml/cex" xmlns:w16cid="http://schemas.microsoft.com/office/word/2016/wordml/cid" xmlns:w16="http://schemas.microsoft.com/office/word/2018/wordml" xmlns:w16du="http://schemas.microsoft.com/office/word/2023/wordml/word16du" xmlns:w16sdtdh="http://schemas.microsoft.com/office/word/2020/wordml/sdtdatahash" xmlns:w16sdtfl="http://schemas.microsoft.com/office/word/2024/wordml/sdtformatlock" xmlns:w16se="http://schemas.microsoft.com/office/word/2015/wordml/symex" xmlns:wpg="http://schemas.microsoft.com/office/word/2010/wordprocessingGroup" xmlns:wpi="http://schemas.microsoft.com/office/word/2010/wordprocessingInk" xmlns:wne="http://schemas.microsoft.com/office/word/2006/wordml" xmlns:wps="http://schemas.microsoft.com/office/word/2010/wordprocessingShape" mc:Ignorable="w14 w15 w16se w16cid w16 w16cex w16sdtdh w16sdtfl w16du wp14">
+  <w:p>
+    <w:pPr>
+      <w:pStyle w:val="Header"/>
+    </w:pPr>
+  </w:p>
+</w:hdr>
+</file>
+
+<file path=word/header2.xml><?xml version="1.0" encoding="utf-8"?>
 <w:hdr xmlns:wpc="http://schemas.microsoft.com/office/word/2010/wordprocessingCanvas" xmlns:cx="http://schemas.microsoft.com/office/drawing/2014/chartex" xmlns:cx1="http://schemas.microsoft.com/office/drawing/2015/9/8/chartex" xmlns:cx2="http://schemas.microsoft.com/office/drawing/2015/10/21/chartex" xmlns:cx3="http://schemas.microsoft.com/office/drawing/2016/5/9/chartex" xmlns:cx4="http://schemas.microsoft.com/office/drawing/2016/5/10/chartex" xmlns:cx5="http://schemas.microsoft.com/office/drawing/2016/5/11/chartex" xmlns:cx6="http://schemas.microsoft.com/office/drawing/2016/5/12/chartex" xmlns:cx7="http://schemas.microsoft.com/office/drawing/2016/5/13/chartex" xmlns:cx8="http://schemas.microsoft.com/office/drawing/2016/5/14/chartex" xmlns:mc="http://schemas.openxmlformats.org/markup-compatibility/2006" xmlns:aink="http://schemas.microsoft.com/office/drawing/2016/ink" xmlns:am3d="http://schemas.microsoft.com/office/drawing/2017/model3d" xmlns:o="urn:schemas-microsoft-com:office:office" xmlns:oel="http://schemas.microsoft.com/office/2019/extlst" xmlns:r="http://schemas.openxmlformats.org/officeDocument/2006/relationships" xmlns:m="http://schemas.openxmlformats.org/officeDocument/2006/math" xmlns:v="urn:schemas-microsoft-com:vml" xmlns:wp14="http://schemas.microsoft.com/office/word/2010/wordprocessingDrawing" xmlns:wp="http://schemas.openxmlformats.org/drawingml/2006/wordprocessingDrawing" xmlns:w10="urn:schemas-microsoft-com:office:word" xmlns:w="http://schemas.openxmlformats.org/wordprocessingml/2006/main" xmlns:w14="http://schemas.microsoft.com/office/word/2010/wordml" xmlns:w15="http://schemas.microsoft.com/office/word/2012/wordml" xmlns:w16cex="http://schemas.microsoft.com/office/word/2018/wordml/cex" xmlns:w16cid="http://schemas.microsoft.com/office/word/2016/wordml/cid" xmlns:w16="http://schemas.microsoft.com/office/word/2018/wordml" xmlns:w16du="http://schemas.microsoft.com/office/word/2023/wordml/word16du" xmlns:w16sdtdh="http://schemas.microsoft.com/office/word/2020/wordml/sdtdatahash" xmlns:w16sdtfl="http://schemas.microsoft.com/office/word/2024/wordml/sdtformatlock" xmlns:w16se="http://schemas.microsoft.com/office/word/2015/wordml/symex" xmlns:wpg="http://schemas.microsoft.com/office/word/2010/wordprocessingGroup" xmlns:wpi="http://schemas.microsoft.com/office/word/2010/wordprocessingInk" xmlns:wne="http://schemas.microsoft.com/office/word/2006/wordml" xmlns:wps="http://schemas.microsoft.com/office/word/2010/wordprocessingShape" mc:Ignorable="w14 w15 w16se w16cid w16 w16cex w16sdtdh w16sdtfl w16du wp14">
   <w:tbl>
     <w:tblPr>
@@ -1108,23 +1142,13 @@
             <w:t>IF_HA_Northern</w:t>
           </w:r>
           <w:proofErr w:type="spellEnd"/>
-          <w:proofErr w:type="gramStart"/>
           <w:r>
             <w:rPr>
               <w:sz w:val="10"/>
               <w:szCs w:val="10"/>
               <w:lang w:val="en-CA" w:eastAsia="en-CA"/>
             </w:rPr>
-            <w:t>}}{</w:t>
-          </w:r>
-          <w:proofErr w:type="gramEnd"/>
-          <w:r>
-            <w:rPr>
-              <w:sz w:val="10"/>
-              <w:szCs w:val="10"/>
-              <w:lang w:val="en-CA" w:eastAsia="en-CA"/>
-            </w:rPr>
-            <w:t>{#IF_HA_Interior}}</w:t>
+            <w:t>}}{{#IF_HA_Interior}}</w:t>
           </w:r>
           <w:r>
             <w:rPr>
@@ -1187,23 +1211,13 @@
             <w:t>IF_HA_Interior</w:t>
           </w:r>
           <w:proofErr w:type="spellEnd"/>
-          <w:proofErr w:type="gramStart"/>
           <w:r>
             <w:rPr>
               <w:sz w:val="10"/>
               <w:szCs w:val="10"/>
               <w:lang w:val="en-CA" w:eastAsia="en-CA"/>
             </w:rPr>
-            <w:t>}}{</w:t>
-          </w:r>
-          <w:proofErr w:type="gramEnd"/>
-          <w:r>
-            <w:rPr>
-              <w:sz w:val="10"/>
-              <w:szCs w:val="10"/>
-              <w:lang w:val="en-CA" w:eastAsia="en-CA"/>
-            </w:rPr>
-            <w:t>{#IF_HA_Island}}</w:t>
+            <w:t>}}{{#IF_HA_Island}}</w:t>
           </w:r>
           <w:r>
             <w:rPr>
@@ -1266,23 +1280,13 @@
             <w:t>IF_HA_Island</w:t>
           </w:r>
           <w:proofErr w:type="spellEnd"/>
-          <w:proofErr w:type="gramStart"/>
           <w:r>
             <w:rPr>
               <w:sz w:val="10"/>
               <w:szCs w:val="10"/>
               <w:lang w:val="en-CA" w:eastAsia="en-CA"/>
             </w:rPr>
-            <w:t>}}{</w:t>
-          </w:r>
-          <w:proofErr w:type="gramEnd"/>
-          <w:r>
-            <w:rPr>
-              <w:sz w:val="10"/>
-              <w:szCs w:val="10"/>
-              <w:lang w:val="en-CA" w:eastAsia="en-CA"/>
-            </w:rPr>
-            <w:t>{#IF_HA_VancouverCoastal}}</w:t>
+            <w:t>}}{{#IF_HA_VancouverCoastal}}</w:t>
           </w:r>
           <w:r>
             <w:rPr>
@@ -1452,15 +1456,13 @@
             <w:spacing w:line="200" w:lineRule="auto"/>
             <w:rPr>
               <w:rFonts w:ascii="BC Sans" w:eastAsia="BC Sans" w:hAnsi="BC Sans" w:cs="BC Sans"/>
-              <w:sz w:val="16"/>
-              <w:szCs w:val="16"/>
+              <w:lang w:val="en-CA"/>
             </w:rPr>
           </w:pPr>
           <w:r>
             <w:rPr>
               <w:rFonts w:ascii="BC Sans" w:eastAsia="BC Sans" w:hAnsi="BC Sans" w:cs="BC Sans"/>
-              <w:sz w:val="22"/>
-              <w:szCs w:val="22"/>
+              <w:lang w:val="en-CA"/>
             </w:rPr>
             <w:t>{{</w:t>
           </w:r>
@@ -1468,17 +1470,79 @@
           <w:r>
             <w:rPr>
               <w:rFonts w:ascii="BC Sans" w:eastAsia="BC Sans" w:hAnsi="BC Sans" w:cs="BC Sans"/>
-              <w:sz w:val="22"/>
-              <w:szCs w:val="22"/>
-            </w:rPr>
-            <w:t>HAAddress</w:t>
+              <w:lang w:val="en-CA"/>
+            </w:rPr>
+            <w:t>RTB_HAAddress</w:t>
           </w:r>
           <w:proofErr w:type="spellEnd"/>
           <w:r>
             <w:rPr>
               <w:rFonts w:ascii="BC Sans" w:eastAsia="BC Sans" w:hAnsi="BC Sans" w:cs="BC Sans"/>
-              <w:sz w:val="22"/>
-              <w:szCs w:val="22"/>
+              <w:lang w:val="en-CA"/>
+            </w:rPr>
+            <w:t>}}</w:t>
+          </w:r>
+        </w:p>
+        <w:p>
+          <w:pPr>
+            <w:spacing w:line="200" w:lineRule="auto"/>
+            <w:rPr>
+              <w:rFonts w:ascii="Cambria Math" w:eastAsia="BC Sans" w:hAnsi="Cambria Math" w:cs="Cambria Math"/>
+              <w:lang w:val="en-CA"/>
+            </w:rPr>
+          </w:pPr>
+          <w:r>
+            <w:rPr>
+              <w:rFonts w:ascii="BC Sans" w:eastAsia="BC Sans" w:hAnsi="BC Sans" w:cs="BC Sans"/>
+              <w:lang w:val="en-CA"/>
+            </w:rPr>
+            <w:t>Phone # {{</w:t>
+          </w:r>
+          <w:proofErr w:type="spellStart"/>
+          <w:r>
+            <w:rPr>
+              <w:rFonts w:ascii="BC Sans" w:eastAsia="BC Sans" w:hAnsi="BC Sans" w:cs="BC Sans"/>
+              <w:lang w:val="en-CA"/>
+            </w:rPr>
+            <w:t>HAPhone</w:t>
+          </w:r>
+          <w:proofErr w:type="spellEnd"/>
+          <w:r>
+            <w:rPr>
+              <w:rFonts w:ascii="BC Sans" w:eastAsia="BC Sans" w:hAnsi="BC Sans" w:cs="BC Sans"/>
+              <w:lang w:val="en-CA"/>
+            </w:rPr>
+            <w:t>}}</w:t>
+          </w:r>
+        </w:p>
+        <w:p>
+          <w:pPr>
+            <w:spacing w:line="200" w:lineRule="auto"/>
+            <w:rPr>
+              <w:rFonts w:ascii="BC Sans" w:eastAsia="BC Sans" w:hAnsi="BC Sans" w:cs="BC Sans"/>
+              <w:lang w:val="en-CA"/>
+            </w:rPr>
+          </w:pPr>
+          <w:r>
+            <w:rPr>
+              <w:rFonts w:ascii="BC Sans" w:eastAsia="BC Sans" w:hAnsi="BC Sans" w:cs="BC Sans"/>
+              <w:lang w:val="en-CA"/>
+            </w:rPr>
+            <w:t>GST # {{</w:t>
+          </w:r>
+          <w:proofErr w:type="spellStart"/>
+          <w:r>
+            <w:rPr>
+              <w:rFonts w:ascii="BC Sans" w:eastAsia="BC Sans" w:hAnsi="BC Sans" w:cs="BC Sans"/>
+              <w:lang w:val="en-CA"/>
+            </w:rPr>
+            <w:t>HAGSTNumber</w:t>
+          </w:r>
+          <w:proofErr w:type="spellEnd"/>
+          <w:r>
+            <w:rPr>
+              <w:rFonts w:ascii="BC Sans" w:eastAsia="BC Sans" w:hAnsi="BC Sans" w:cs="BC Sans"/>
+              <w:lang w:val="en-CA"/>
             </w:rPr>
             <w:t>}}</w:t>
           </w:r>
@@ -1488,40 +1552,6 @@
             <w:pStyle w:val="Header"/>
             <w:spacing w:line="360" w:lineRule="auto"/>
           </w:pPr>
-          <w:r>
-            <w:rPr>
-              <w:rFonts w:ascii="BC Sans" w:eastAsia="BC Sans" w:hAnsi="BC Sans" w:cs="BC Sans"/>
-              <w:sz w:val="22"/>
-              <w:szCs w:val="22"/>
-            </w:rPr>
-            <w:t xml:space="preserve">GST # </w:t>
-          </w:r>
-          <w:r>
-            <w:rPr>
-              <w:rFonts w:ascii="BC Sans" w:eastAsia="BC Sans" w:hAnsi="BC Sans" w:cs="BC Sans"/>
-              <w:sz w:val="22"/>
-              <w:szCs w:val="22"/>
-            </w:rPr>
-            <w:t>{{</w:t>
-          </w:r>
-          <w:proofErr w:type="spellStart"/>
-          <w:r>
-            <w:rPr>
-              <w:rFonts w:ascii="BC Sans" w:eastAsia="BC Sans" w:hAnsi="BC Sans" w:cs="BC Sans"/>
-              <w:sz w:val="22"/>
-              <w:szCs w:val="22"/>
-            </w:rPr>
-            <w:t>HAGSTNumber</w:t>
-          </w:r>
-          <w:proofErr w:type="spellEnd"/>
-          <w:r>
-            <w:rPr>
-              <w:rFonts w:ascii="BC Sans" w:eastAsia="BC Sans" w:hAnsi="BC Sans" w:cs="BC Sans"/>
-              <w:sz w:val="22"/>
-              <w:szCs w:val="22"/>
-            </w:rPr>
-            <w:t>}}</w:t>
-          </w:r>
         </w:p>
       </w:tc>
       <w:tc>
@@ -1599,6 +1629,16 @@
       </w:tc>
     </w:tr>
   </w:tbl>
+  <w:p>
+    <w:pPr>
+      <w:pStyle w:val="Header"/>
+    </w:pPr>
+  </w:p>
+</w:hdr>
+</file>
+
+<file path=word/header3.xml><?xml version="1.0" encoding="utf-8"?>
+<w:hdr xmlns:wpc="http://schemas.microsoft.com/office/word/2010/wordprocessingCanvas" xmlns:cx="http://schemas.microsoft.com/office/drawing/2014/chartex" xmlns:cx1="http://schemas.microsoft.com/office/drawing/2015/9/8/chartex" xmlns:cx2="http://schemas.microsoft.com/office/drawing/2015/10/21/chartex" xmlns:cx3="http://schemas.microsoft.com/office/drawing/2016/5/9/chartex" xmlns:cx4="http://schemas.microsoft.com/office/drawing/2016/5/10/chartex" xmlns:cx5="http://schemas.microsoft.com/office/drawing/2016/5/11/chartex" xmlns:cx6="http://schemas.microsoft.com/office/drawing/2016/5/12/chartex" xmlns:cx7="http://schemas.microsoft.com/office/drawing/2016/5/13/chartex" xmlns:cx8="http://schemas.microsoft.com/office/drawing/2016/5/14/chartex" xmlns:mc="http://schemas.openxmlformats.org/markup-compatibility/2006" xmlns:aink="http://schemas.microsoft.com/office/drawing/2016/ink" xmlns:am3d="http://schemas.microsoft.com/office/drawing/2017/model3d" xmlns:o="urn:schemas-microsoft-com:office:office" xmlns:oel="http://schemas.microsoft.com/office/2019/extlst" xmlns:r="http://schemas.openxmlformats.org/officeDocument/2006/relationships" xmlns:m="http://schemas.openxmlformats.org/officeDocument/2006/math" xmlns:v="urn:schemas-microsoft-com:vml" xmlns:wp14="http://schemas.microsoft.com/office/word/2010/wordprocessingDrawing" xmlns:wp="http://schemas.openxmlformats.org/drawingml/2006/wordprocessingDrawing" xmlns:w10="urn:schemas-microsoft-com:office:word" xmlns:w="http://schemas.openxmlformats.org/wordprocessingml/2006/main" xmlns:w14="http://schemas.microsoft.com/office/word/2010/wordml" xmlns:w15="http://schemas.microsoft.com/office/word/2012/wordml" xmlns:w16cex="http://schemas.microsoft.com/office/word/2018/wordml/cex" xmlns:w16cid="http://schemas.microsoft.com/office/word/2016/wordml/cid" xmlns:w16="http://schemas.microsoft.com/office/word/2018/wordml" xmlns:w16du="http://schemas.microsoft.com/office/word/2023/wordml/word16du" xmlns:w16sdtdh="http://schemas.microsoft.com/office/word/2020/wordml/sdtdatahash" xmlns:w16sdtfl="http://schemas.microsoft.com/office/word/2024/wordml/sdtformatlock" xmlns:w16se="http://schemas.microsoft.com/office/word/2015/wordml/symex" xmlns:wpg="http://schemas.microsoft.com/office/word/2010/wordprocessingGroup" xmlns:wpi="http://schemas.microsoft.com/office/word/2010/wordprocessingInk" xmlns:wne="http://schemas.microsoft.com/office/word/2006/wordml" xmlns:wps="http://schemas.microsoft.com/office/word/2010/wordprocessingShape" mc:Ignorable="w14 w15 w16se w16cid w16 w16cex w16sdtdh w16sdtfl w16du wp14">
   <w:p>
     <w:pPr>
       <w:pStyle w:val="Header"/>
@@ -1630,7 +1670,7 @@
         <v:path o:extrusionok="f" gradientshapeok="t" o:connecttype="rect"/>
         <o:lock v:ext="edit" aspectratio="t"/>
       </v:shapetype>
-      <v:shape id="Picture 14" o:spid="_x0000_i1025" type="#_x0000_t75" style="width:18.25pt;height:19.9pt;visibility:visible;mso-wrap-style:square" o:bullet="t">
+      <v:shape id="Picture 14" o:spid="_x0000_i1025" type="#_x0000_t75" style="width:18.5pt;height:20pt;visibility:visible;mso-wrap-style:square" o:bullet="t">
         <v:imagedata r:id="rId1" o:title=""/>
       </v:shape>
     </w:pict>
@@ -2476,7 +2516,6 @@
   <w:style w:type="character" w:default="1" w:styleId="DefaultParagraphFont">
     <w:name w:val="Default Paragraph Font"/>
     <w:uiPriority w:val="1"/>
-    <w:semiHidden/>
     <w:unhideWhenUsed/>
   </w:style>
   <w:style w:type="table" w:default="1" w:styleId="TableNormal">
@@ -3302,30 +3341,6 @@
 </file>
 
 <file path=customXml/item1.xml><?xml version="1.0" encoding="utf-8"?>
-<?mso-contentType ?>
-<FormTemplates xmlns="http://schemas.microsoft.com/sharepoint/v3/contenttype/forms">
-  <Display>DocumentLibraryForm</Display>
-  <Edit>DocumentLibraryForm</Edit>
-  <New>DocumentLibraryForm</New>
-</FormTemplates>
-</file>
-
-<file path=customXml/item2.xml><?xml version="1.0" encoding="utf-8"?>
-<b:Sources xmlns:b="http://schemas.openxmlformats.org/officeDocument/2006/bibliography" xmlns="http://schemas.openxmlformats.org/officeDocument/2006/bibliography" SelectedStyle="\APASixthEditionOfficeOnline.xsl" StyleName="APA" Version="6"/>
-</file>
-
-<file path=customXml/item3.xml><?xml version="1.0" encoding="utf-8"?>
-<p:properties xmlns:p="http://schemas.microsoft.com/office/2006/metadata/properties" xmlns:xsi="http://www.w3.org/2001/XMLSchema-instance" xmlns:pc="http://schemas.microsoft.com/office/infopath/2007/PartnerControls">
-  <documentManagement>
-    <lcf76f155ced4ddcb4097134ff3c332f xmlns="94d5cf59-5162-48bc-aa9b-620df72947f5">
-      <Terms xmlns="http://schemas.microsoft.com/office/infopath/2007/PartnerControls"/>
-    </lcf76f155ced4ddcb4097134ff3c332f>
-    <TaxCatchAll xmlns="8350b7c0-334b-4e19-bfc1-744f6a979eee" xsi:nil="true"/>
-  </documentManagement>
-</p:properties>
-</file>
-
-<file path=customXml/item4.xml><?xml version="1.0" encoding="utf-8"?>
 <ct:contentTypeSchema xmlns:ct="http://schemas.microsoft.com/office/2006/metadata/contentType" xmlns:ma="http://schemas.microsoft.com/office/2006/metadata/properties/metaAttributes" ct:_="" ma:_="" ma:contentTypeName="Document" ma:contentTypeID="0x01010015F16144C0593A4A82C8AE0B67DB460F" ma:contentTypeVersion="11" ma:contentTypeDescription="Create a new document." ma:contentTypeScope="" ma:versionID="f03428ffc1746d68619392bc270e65d0">
   <xsd:schema xmlns:xsd="http://www.w3.org/2001/XMLSchema" xmlns:xs="http://www.w3.org/2001/XMLSchema" xmlns:p="http://schemas.microsoft.com/office/2006/metadata/properties" xmlns:ns2="94d5cf59-5162-48bc-aa9b-620df72947f5" xmlns:ns3="8350b7c0-334b-4e19-bfc1-744f6a979eee" targetNamespace="http://schemas.microsoft.com/office/2006/metadata/properties" ma:root="true" ma:fieldsID="2206ae29c74f0be434f81d51f34f460d" ns2:_="" ns3:_="">
     <xsd:import namespace="94d5cf59-5162-48bc-aa9b-620df72947f5"/>
@@ -3520,34 +3535,31 @@
 </ct:contentTypeSchema>
 </file>
 
-<file path=customXml/itemProps1.xml><?xml version="1.0" encoding="utf-8"?>
-<ds:datastoreItem xmlns:ds="http://schemas.openxmlformats.org/officeDocument/2006/customXml" ds:itemID="{D7CEB92D-E4AC-496B-B8CD-DC145F36CFDD}">
-  <ds:schemaRefs>
-    <ds:schemaRef ds:uri="http://schemas.microsoft.com/sharepoint/v3/contenttype/forms"/>
-  </ds:schemaRefs>
-</ds:datastoreItem>
+<file path=customXml/item2.xml><?xml version="1.0" encoding="utf-8"?>
+<p:properties xmlns:p="http://schemas.microsoft.com/office/2006/metadata/properties" xmlns:xsi="http://www.w3.org/2001/XMLSchema-instance" xmlns:pc="http://schemas.microsoft.com/office/infopath/2007/PartnerControls">
+  <documentManagement>
+    <lcf76f155ced4ddcb4097134ff3c332f xmlns="94d5cf59-5162-48bc-aa9b-620df72947f5">
+      <Terms xmlns="http://schemas.microsoft.com/office/infopath/2007/PartnerControls"/>
+    </lcf76f155ced4ddcb4097134ff3c332f>
+    <TaxCatchAll xmlns="8350b7c0-334b-4e19-bfc1-744f6a979eee" xsi:nil="true"/>
+  </documentManagement>
+</p:properties>
 </file>
 
-<file path=customXml/itemProps2.xml><?xml version="1.0" encoding="utf-8"?>
-<ds:datastoreItem xmlns:ds="http://schemas.openxmlformats.org/officeDocument/2006/customXml" ds:itemID="{1B13D280-DAE9-4159-8E27-0B6001C23F99}">
-  <ds:schemaRefs>
-    <ds:schemaRef ds:uri="http://schemas.openxmlformats.org/officeDocument/2006/bibliography"/>
-  </ds:schemaRefs>
-</ds:datastoreItem>
+<file path=customXml/item3.xml><?xml version="1.0" encoding="utf-8"?>
+<b:Sources xmlns:b="http://schemas.openxmlformats.org/officeDocument/2006/bibliography" xmlns="http://schemas.openxmlformats.org/officeDocument/2006/bibliography" SelectedStyle="\APASixthEditionOfficeOnline.xsl" StyleName="APA" Version="6"/>
 </file>
 
-<file path=customXml/itemProps3.xml><?xml version="1.0" encoding="utf-8"?>
-<ds:datastoreItem xmlns:ds="http://schemas.openxmlformats.org/officeDocument/2006/customXml" ds:itemID="{3DC3E886-FAA3-4F9D-BAB3-B7FA9EEB26D5}">
-  <ds:schemaRefs>
-    <ds:schemaRef ds:uri="http://schemas.microsoft.com/office/2006/metadata/properties"/>
-    <ds:schemaRef ds:uri="http://schemas.microsoft.com/office/infopath/2007/PartnerControls"/>
-    <ds:schemaRef ds:uri="94d5cf59-5162-48bc-aa9b-620df72947f5"/>
-    <ds:schemaRef ds:uri="8350b7c0-334b-4e19-bfc1-744f6a979eee"/>
-  </ds:schemaRefs>
-</ds:datastoreItem>
+<file path=customXml/item4.xml><?xml version="1.0" encoding="utf-8"?>
+<?mso-contentType ?>
+<FormTemplates xmlns="http://schemas.microsoft.com/sharepoint/v3/contenttype/forms">
+  <Display>DocumentLibraryForm</Display>
+  <Edit>DocumentLibraryForm</Edit>
+  <New>DocumentLibraryForm</New>
+</FormTemplates>
 </file>
 
-<file path=customXml/itemProps4.xml><?xml version="1.0" encoding="utf-8"?>
+<file path=customXml/itemProps1.xml><?xml version="1.0" encoding="utf-8"?>
 <ds:datastoreItem xmlns:ds="http://schemas.openxmlformats.org/officeDocument/2006/customXml" ds:itemID="{C4741666-369F-4F81-99B9-33314B90D955}">
   <ds:schemaRefs>
     <ds:schemaRef ds:uri="http://schemas.microsoft.com/office/2006/metadata/contentType"/>
@@ -3566,6 +3578,33 @@
 </ds:datastoreItem>
 </file>
 
+<file path=customXml/itemProps2.xml><?xml version="1.0" encoding="utf-8"?>
+<ds:datastoreItem xmlns:ds="http://schemas.openxmlformats.org/officeDocument/2006/customXml" ds:itemID="{3DC3E886-FAA3-4F9D-BAB3-B7FA9EEB26D5}">
+  <ds:schemaRefs>
+    <ds:schemaRef ds:uri="http://schemas.microsoft.com/office/2006/metadata/properties"/>
+    <ds:schemaRef ds:uri="http://schemas.microsoft.com/office/infopath/2007/PartnerControls"/>
+    <ds:schemaRef ds:uri="94d5cf59-5162-48bc-aa9b-620df72947f5"/>
+    <ds:schemaRef ds:uri="8350b7c0-334b-4e19-bfc1-744f6a979eee"/>
+  </ds:schemaRefs>
+</ds:datastoreItem>
+</file>
+
+<file path=customXml/itemProps3.xml><?xml version="1.0" encoding="utf-8"?>
+<ds:datastoreItem xmlns:ds="http://schemas.openxmlformats.org/officeDocument/2006/customXml" ds:itemID="{1B13D280-DAE9-4159-8E27-0B6001C23F99}">
+  <ds:schemaRefs>
+    <ds:schemaRef ds:uri="http://schemas.openxmlformats.org/officeDocument/2006/bibliography"/>
+  </ds:schemaRefs>
+</ds:datastoreItem>
+</file>
+
+<file path=customXml/itemProps4.xml><?xml version="1.0" encoding="utf-8"?>
+<ds:datastoreItem xmlns:ds="http://schemas.openxmlformats.org/officeDocument/2006/customXml" ds:itemID="{D7CEB92D-E4AC-496B-B8CD-DC145F36CFDD}">
+  <ds:schemaRefs>
+    <ds:schemaRef ds:uri="http://schemas.microsoft.com/sharepoint/v3/contenttype/forms"/>
+  </ds:schemaRefs>
+</ds:datastoreItem>
+</file>
+
 <file path=docMetadata/LabelInfo.xml><?xml version="1.0" encoding="utf-8"?>
 <clbl:labelList xmlns:clbl="http://schemas.microsoft.com/office/2020/mipLabelMetadata">
   <clbl:label id="{e0793d39-0939-496d-b129-198edd916feb}" enabled="0" method="" siteId="{e0793d39-0939-496d-b129-198edd916feb}" removed="1"/>

</xml_diff>

<commit_message>
EHIS-5045 [ Receipt Geraeration bug fix]
</commit_message>
<xml_diff>
--- a/PHOCS-Docgentemplates/PHOCSReceiptTemplate.docx
+++ b/PHOCS-Docgentemplates/PHOCSReceiptTemplate.docx
@@ -273,36 +273,6 @@
                           <w:spacing w:after="0" w:line="240" w:lineRule="auto"/>
                           <w:textAlignment w:val="baseline"/>
                           <w:rPr>
-                            <w:rFonts w:ascii="BC Sans" w:eastAsia="Times New Roman" w:hAnsi="BC Sans" w:cs="Segoe UI"/>
-                            <w:kern w:val="0"/>
-                            <w:sz w:val="22"/>
-                            <w:szCs w:val="22"/>
-                            <w14:ligatures w14:val="none"/>
-                          </w:rPr>
-                        </w:pPr>
-                      </w:p>
-                    </w:tc>
-                  </w:tr>
-                  <w:tr>
-                    <w:trPr>
-                      <w:trHeight w:val="300"/>
-                    </w:trPr>
-                    <w:tc>
-                      <w:tcPr>
-                        <w:tcW w:w="5582" w:type="dxa"/>
-                        <w:tcBorders>
-                          <w:top w:val="nil"/>
-                          <w:left w:val="nil"/>
-                          <w:bottom w:val="nil"/>
-                          <w:right w:val="nil"/>
-                        </w:tcBorders>
-                        <w:shd w:val="clear" w:color="auto" w:fill="FFFFFF"/>
-                      </w:tcPr>
-                      <w:p>
-                        <w:pPr>
-                          <w:spacing w:after="0" w:line="240" w:lineRule="auto"/>
-                          <w:textAlignment w:val="baseline"/>
-                          <w:rPr>
                             <w:rFonts w:ascii="Segoe UI" w:eastAsia="Times New Roman" w:hAnsi="Segoe UI" w:cs="Segoe UI"/>
                             <w:kern w:val="0"/>
                             <w:sz w:val="18"/>
@@ -353,13 +323,20 @@
       <w:tr>
         <w:trPr>
           <w:cnfStyle w:val="000000100000" w:firstRow="0" w:lastRow="0" w:firstColumn="0" w:lastColumn="0" w:oddVBand="0" w:evenVBand="0" w:oddHBand="1" w:evenHBand="0" w:firstRowFirstColumn="0" w:firstRowLastColumn="0" w:lastRowFirstColumn="0" w:lastRowLastColumn="0"/>
-          <w:trHeight w:val="1355"/>
+          <w:trHeight w:val="1761"/>
         </w:trPr>
         <w:tc>
           <w:tcPr>
             <w:cnfStyle w:val="001000000000" w:firstRow="0" w:lastRow="0" w:firstColumn="1" w:lastColumn="0" w:oddVBand="0" w:evenVBand="0" w:oddHBand="0" w:evenHBand="0" w:firstRowFirstColumn="0" w:firstRowLastColumn="0" w:lastRowFirstColumn="0" w:lastRowLastColumn="0"/>
-            <w:tcW w:w="9360" w:type="dxa"/>
+            <w:tcW w:w="2925" w:type="dxa"/>
             <w:shd w:val="clear" w:color="auto" w:fill="FFFFFF" w:themeFill="background1"/>
+            <w:tcMar>
+              <w:top w:w="0" w:type="dxa"/>
+              <w:left w:w="108" w:type="dxa"/>
+              <w:bottom w:w="0" w:type="dxa"/>
+              <w:right w:w="108" w:type="dxa"/>
+            </w:tcMar>
+            <w:hideMark/>
           </w:tcPr>
           <w:tbl>
             <w:tblPr>
@@ -368,9 +345,9 @@
               <w:tblLook w:val="04A0" w:firstRow="1" w:lastRow="0" w:firstColumn="1" w:lastColumn="0" w:noHBand="0" w:noVBand="1"/>
             </w:tblPr>
             <w:tblGrid>
-              <w:gridCol w:w="1895"/>
-              <w:gridCol w:w="2783"/>
-              <w:gridCol w:w="2219"/>
+              <w:gridCol w:w="1872"/>
+              <w:gridCol w:w="2928"/>
+              <w:gridCol w:w="2097"/>
               <w:gridCol w:w="2350"/>
             </w:tblGrid>
             <w:tr>
@@ -379,7 +356,7 @@
               </w:trPr>
               <w:tc>
                 <w:tcPr>
-                  <w:tcW w:w="1895" w:type="dxa"/>
+                  <w:tcW w:w="1872" w:type="dxa"/>
                   <w:tcBorders>
                     <w:top w:val="single" w:sz="4" w:space="0" w:color="auto"/>
                     <w:left w:val="single" w:sz="4" w:space="0" w:color="auto"/>
@@ -390,6 +367,7 @@
                 </w:tcPr>
                 <w:p>
                   <w:pPr>
+                    <w:jc w:val="center"/>
                     <w:rPr>
                       <w:rFonts w:ascii="BC Sans" w:eastAsia="BC Sans" w:hAnsi="BC Sans" w:cs="BC Sans"/>
                       <w:b/>
@@ -400,7 +378,7 @@
                   </w:pPr>
                   <w:r>
                     <w:rPr>
-                      <w:rFonts w:ascii="BC Sans" w:eastAsia="BC Sans" w:hAnsi="BC Sans" w:cs="BC Sans"/>
+                      <w:rFonts w:ascii="BC Sans" w:hAnsi="BC Sans"/>
                       <w:b/>
                       <w:bCs/>
                       <w:sz w:val="22"/>
@@ -412,7 +390,7 @@
               </w:tc>
               <w:tc>
                 <w:tcPr>
-                  <w:tcW w:w="2783" w:type="dxa"/>
+                  <w:tcW w:w="2928" w:type="dxa"/>
                   <w:tcBorders>
                     <w:top w:val="single" w:sz="4" w:space="0" w:color="auto"/>
                     <w:left w:val="single" w:sz="4" w:space="0" w:color="auto"/>
@@ -423,6 +401,7 @@
                 </w:tcPr>
                 <w:p>
                   <w:pPr>
+                    <w:jc w:val="center"/>
                     <w:rPr>
                       <w:rFonts w:ascii="BC Sans" w:eastAsia="BC Sans" w:hAnsi="BC Sans" w:cs="BC Sans"/>
                       <w:b/>
@@ -433,7 +412,7 @@
                   </w:pPr>
                   <w:r>
                     <w:rPr>
-                      <w:rFonts w:ascii="BC Sans" w:eastAsia="BC Sans" w:hAnsi="BC Sans" w:cs="BC Sans"/>
+                      <w:rFonts w:ascii="BC Sans" w:hAnsi="BC Sans"/>
                       <w:b/>
                       <w:bCs/>
                       <w:sz w:val="22"/>
@@ -445,7 +424,7 @@
               </w:tc>
               <w:tc>
                 <w:tcPr>
-                  <w:tcW w:w="2219" w:type="dxa"/>
+                  <w:tcW w:w="2097" w:type="dxa"/>
                   <w:tcBorders>
                     <w:top w:val="single" w:sz="4" w:space="0" w:color="auto"/>
                     <w:left w:val="single" w:sz="4" w:space="0" w:color="auto"/>
@@ -456,6 +435,7 @@
                 </w:tcPr>
                 <w:p>
                   <w:pPr>
+                    <w:jc w:val="center"/>
                     <w:rPr>
                       <w:rFonts w:ascii="BC Sans" w:eastAsia="BC Sans" w:hAnsi="BC Sans" w:cs="BC Sans"/>
                       <w:b/>
@@ -466,7 +446,7 @@
                   </w:pPr>
                   <w:r>
                     <w:rPr>
-                      <w:rFonts w:ascii="BC Sans" w:eastAsia="BC Sans" w:hAnsi="BC Sans" w:cs="BC Sans"/>
+                      <w:rFonts w:ascii="BC Sans" w:hAnsi="BC Sans"/>
                       <w:b/>
                       <w:bCs/>
                       <w:sz w:val="22"/>
@@ -489,6 +469,7 @@
                 </w:tcPr>
                 <w:p>
                   <w:pPr>
+                    <w:jc w:val="center"/>
                     <w:rPr>
                       <w:rFonts w:ascii="BC Sans" w:eastAsia="BC Sans" w:hAnsi="BC Sans" w:cs="BC Sans"/>
                       <w:b/>
@@ -516,7 +497,7 @@
               </w:trPr>
               <w:tc>
                 <w:tcPr>
-                  <w:tcW w:w="1895" w:type="dxa"/>
+                  <w:tcW w:w="1872" w:type="dxa"/>
                   <w:tcBorders>
                     <w:top w:val="single" w:sz="4" w:space="0" w:color="auto"/>
                     <w:left w:val="single" w:sz="4" w:space="0" w:color="auto"/>
@@ -527,7 +508,6 @@
                 </w:tcPr>
                 <w:p>
                   <w:pPr>
-                    <w:jc w:val="both"/>
                     <w:rPr>
                       <w:rFonts w:ascii="BC Sans" w:eastAsia="BC Sans" w:hAnsi="BC Sans" w:cs="BC Sans"/>
                       <w:sz w:val="22"/>
@@ -536,43 +516,27 @@
                   </w:pPr>
                   <w:r>
                     <w:rPr>
-                      <w:rFonts w:ascii="BC Sans" w:eastAsia="BC Sans" w:hAnsi="BC Sans" w:cs="BC Sans"/>
-                      <w:sz w:val="22"/>
-                      <w:szCs w:val="22"/>
-                    </w:rPr>
-                    <w:t>{{#RTFItem}}</w:t>
-                  </w:r>
-                  <w:r>
-                    <w:rPr>
-                      <w:rFonts w:ascii="BC Sans" w:eastAsia="BC Sans" w:hAnsi="BC Sans" w:cs="BC Sans"/>
-                      <w:sz w:val="22"/>
-                      <w:szCs w:val="22"/>
-                    </w:rPr>
-                    <w:t xml:space="preserve"> </w:t>
-                  </w:r>
-                  <w:r>
-                    <w:rPr>
-                      <w:rFonts w:ascii="BC Sans" w:eastAsia="BC Sans" w:hAnsi="BC Sans" w:cs="BC Sans"/>
-                      <w:sz w:val="22"/>
-                      <w:szCs w:val="22"/>
-                    </w:rPr>
-                    <w:t>{{</w:t>
+                      <w:rFonts w:ascii="BC Sans" w:hAnsi="BC Sans"/>
+                      <w:sz w:val="20"/>
+                      <w:szCs w:val="20"/>
+                    </w:rPr>
+                    <w:t>{{#RTFItem}} {{</w:t>
                   </w:r>
                   <w:proofErr w:type="spellStart"/>
                   <w:r>
                     <w:rPr>
-                      <w:rFonts w:ascii="BC Sans" w:eastAsia="BC Sans" w:hAnsi="BC Sans" w:cs="BC Sans"/>
-                      <w:sz w:val="22"/>
-                      <w:szCs w:val="22"/>
+                      <w:rFonts w:ascii="BC Sans" w:hAnsi="BC Sans"/>
+                      <w:sz w:val="20"/>
+                      <w:szCs w:val="20"/>
                     </w:rPr>
                     <w:t>PaymentDate</w:t>
                   </w:r>
                   <w:proofErr w:type="spellEnd"/>
                   <w:r>
                     <w:rPr>
-                      <w:rFonts w:ascii="BC Sans" w:eastAsia="BC Sans" w:hAnsi="BC Sans" w:cs="BC Sans"/>
-                      <w:sz w:val="22"/>
-                      <w:szCs w:val="22"/>
+                      <w:rFonts w:ascii="BC Sans" w:hAnsi="BC Sans"/>
+                      <w:sz w:val="20"/>
+                      <w:szCs w:val="20"/>
                     </w:rPr>
                     <w:t>}}</w:t>
                   </w:r>
@@ -580,7 +544,7 @@
               </w:tc>
               <w:tc>
                 <w:tcPr>
-                  <w:tcW w:w="2783" w:type="dxa"/>
+                  <w:tcW w:w="2928" w:type="dxa"/>
                   <w:tcBorders>
                     <w:top w:val="single" w:sz="4" w:space="0" w:color="auto"/>
                     <w:left w:val="single" w:sz="4" w:space="0" w:color="auto"/>
@@ -591,6 +555,7 @@
                 </w:tcPr>
                 <w:p>
                   <w:pPr>
+                    <w:jc w:val="center"/>
                     <w:rPr>
                       <w:rFonts w:ascii="BC Sans" w:eastAsia="BC Sans" w:hAnsi="BC Sans" w:cs="BC Sans"/>
                       <w:sz w:val="22"/>
@@ -599,7 +564,7 @@
                   </w:pPr>
                   <w:r>
                     <w:rPr>
-                      <w:rFonts w:ascii="BC Sans" w:eastAsia="BC Sans" w:hAnsi="BC Sans" w:cs="BC Sans"/>
+                      <w:rFonts w:ascii="BC Sans" w:hAnsi="BC Sans"/>
                       <w:sz w:val="22"/>
                       <w:szCs w:val="22"/>
                     </w:rPr>
@@ -608,16 +573,16 @@
                   <w:proofErr w:type="spellStart"/>
                   <w:r>
                     <w:rPr>
-                      <w:rFonts w:ascii="BC Sans" w:eastAsia="BC Sans" w:hAnsi="BC Sans" w:cs="BC Sans"/>
+                      <w:rFonts w:ascii="BC Sans" w:hAnsi="BC Sans"/>
                       <w:sz w:val="22"/>
                       <w:szCs w:val="22"/>
                     </w:rPr>
-                    <w:t>RTFItemFeeType</w:t>
+                    <w:t>FeeType</w:t>
                   </w:r>
                   <w:proofErr w:type="spellEnd"/>
                   <w:r>
                     <w:rPr>
-                      <w:rFonts w:ascii="BC Sans" w:eastAsia="BC Sans" w:hAnsi="BC Sans" w:cs="BC Sans"/>
+                      <w:rFonts w:ascii="BC Sans" w:hAnsi="BC Sans"/>
                       <w:sz w:val="22"/>
                       <w:szCs w:val="22"/>
                     </w:rPr>
@@ -627,7 +592,7 @@
               </w:tc>
               <w:tc>
                 <w:tcPr>
-                  <w:tcW w:w="2219" w:type="dxa"/>
+                  <w:tcW w:w="2097" w:type="dxa"/>
                   <w:tcBorders>
                     <w:top w:val="single" w:sz="4" w:space="0" w:color="auto"/>
                     <w:left w:val="single" w:sz="4" w:space="0" w:color="auto"/>
@@ -638,6 +603,7 @@
                 </w:tcPr>
                 <w:p>
                   <w:pPr>
+                    <w:jc w:val="center"/>
                     <w:rPr>
                       <w:rFonts w:ascii="BC Sans" w:eastAsia="BC Sans" w:hAnsi="BC Sans" w:cs="BC Sans"/>
                       <w:sz w:val="22"/>
@@ -646,7 +612,7 @@
                   </w:pPr>
                   <w:r>
                     <w:rPr>
-                      <w:rFonts w:ascii="BC Sans" w:eastAsia="BC Sans" w:hAnsi="BC Sans" w:cs="BC Sans"/>
+                      <w:rFonts w:ascii="BC Sans" w:hAnsi="BC Sans"/>
                       <w:sz w:val="22"/>
                       <w:szCs w:val="22"/>
                     </w:rPr>
@@ -655,7 +621,7 @@
                   <w:proofErr w:type="spellStart"/>
                   <w:r>
                     <w:rPr>
-                      <w:rFonts w:ascii="BC Sans" w:eastAsia="BC Sans" w:hAnsi="BC Sans" w:cs="BC Sans"/>
+                      <w:rFonts w:ascii="BC Sans" w:hAnsi="BC Sans"/>
                       <w:sz w:val="22"/>
                       <w:szCs w:val="22"/>
                     </w:rPr>
@@ -664,7 +630,7 @@
                   <w:proofErr w:type="spellEnd"/>
                   <w:r>
                     <w:rPr>
-                      <w:rFonts w:ascii="BC Sans" w:eastAsia="BC Sans" w:hAnsi="BC Sans" w:cs="BC Sans"/>
+                      <w:rFonts w:ascii="BC Sans" w:hAnsi="BC Sans"/>
                       <w:sz w:val="22"/>
                       <w:szCs w:val="22"/>
                     </w:rPr>
@@ -1142,13 +1108,23 @@
             <w:t>IF_HA_Northern</w:t>
           </w:r>
           <w:proofErr w:type="spellEnd"/>
+          <w:proofErr w:type="gramStart"/>
           <w:r>
             <w:rPr>
               <w:sz w:val="10"/>
               <w:szCs w:val="10"/>
               <w:lang w:val="en-CA" w:eastAsia="en-CA"/>
             </w:rPr>
-            <w:t>}}{{#IF_HA_Interior}}</w:t>
+            <w:t>}}{</w:t>
+          </w:r>
+          <w:proofErr w:type="gramEnd"/>
+          <w:r>
+            <w:rPr>
+              <w:sz w:val="10"/>
+              <w:szCs w:val="10"/>
+              <w:lang w:val="en-CA" w:eastAsia="en-CA"/>
+            </w:rPr>
+            <w:t>{#IF_HA_Interior}}</w:t>
           </w:r>
           <w:r>
             <w:rPr>
@@ -1211,13 +1187,23 @@
             <w:t>IF_HA_Interior</w:t>
           </w:r>
           <w:proofErr w:type="spellEnd"/>
+          <w:proofErr w:type="gramStart"/>
           <w:r>
             <w:rPr>
               <w:sz w:val="10"/>
               <w:szCs w:val="10"/>
               <w:lang w:val="en-CA" w:eastAsia="en-CA"/>
             </w:rPr>
-            <w:t>}}{{#IF_HA_Island}}</w:t>
+            <w:t>}}{</w:t>
+          </w:r>
+          <w:proofErr w:type="gramEnd"/>
+          <w:r>
+            <w:rPr>
+              <w:sz w:val="10"/>
+              <w:szCs w:val="10"/>
+              <w:lang w:val="en-CA" w:eastAsia="en-CA"/>
+            </w:rPr>
+            <w:t>{#IF_HA_Island}}</w:t>
           </w:r>
           <w:r>
             <w:rPr>
@@ -1280,13 +1266,23 @@
             <w:t>IF_HA_Island</w:t>
           </w:r>
           <w:proofErr w:type="spellEnd"/>
+          <w:proofErr w:type="gramStart"/>
           <w:r>
             <w:rPr>
               <w:sz w:val="10"/>
               <w:szCs w:val="10"/>
               <w:lang w:val="en-CA" w:eastAsia="en-CA"/>
             </w:rPr>
-            <w:t>}}{{#IF_HA_VancouverCoastal}}</w:t>
+            <w:t>}}{</w:t>
+          </w:r>
+          <w:proofErr w:type="gramEnd"/>
+          <w:r>
+            <w:rPr>
+              <w:sz w:val="10"/>
+              <w:szCs w:val="10"/>
+              <w:lang w:val="en-CA" w:eastAsia="en-CA"/>
+            </w:rPr>
+            <w:t>{#IF_HA_VancouverCoastal}}</w:t>
           </w:r>
           <w:r>
             <w:rPr>
@@ -1670,7 +1666,7 @@
         <v:path o:extrusionok="f" gradientshapeok="t" o:connecttype="rect"/>
         <o:lock v:ext="edit" aspectratio="t"/>
       </v:shapetype>
-      <v:shape id="Picture 14" o:spid="_x0000_i1025" type="#_x0000_t75" style="width:18.5pt;height:20pt;visibility:visible;mso-wrap-style:square" o:bullet="t">
+      <v:shape id="Picture 14" o:spid="_x0000_i1025" type="#_x0000_t75" style="width:18.6pt;height:19.8pt;visibility:visible;mso-wrap-style:square" o:bullet="t">
         <v:imagedata r:id="rId1" o:title=""/>
       </v:shape>
     </w:pict>
@@ -2516,6 +2512,7 @@
   <w:style w:type="character" w:default="1" w:styleId="DefaultParagraphFont">
     <w:name w:val="Default Paragraph Font"/>
     <w:uiPriority w:val="1"/>
+    <w:semiHidden/>
     <w:unhideWhenUsed/>
   </w:style>
   <w:style w:type="table" w:default="1" w:styleId="TableNormal">
@@ -3341,6 +3338,30 @@
 </file>
 
 <file path=customXml/item1.xml><?xml version="1.0" encoding="utf-8"?>
+<?mso-contentType ?>
+<FormTemplates xmlns="http://schemas.microsoft.com/sharepoint/v3/contenttype/forms">
+  <Display>DocumentLibraryForm</Display>
+  <Edit>DocumentLibraryForm</Edit>
+  <New>DocumentLibraryForm</New>
+</FormTemplates>
+</file>
+
+<file path=customXml/item2.xml><?xml version="1.0" encoding="utf-8"?>
+<b:Sources xmlns:b="http://schemas.openxmlformats.org/officeDocument/2006/bibliography" xmlns="http://schemas.openxmlformats.org/officeDocument/2006/bibliography" SelectedStyle="\APASixthEditionOfficeOnline.xsl" StyleName="APA" Version="6"/>
+</file>
+
+<file path=customXml/item3.xml><?xml version="1.0" encoding="utf-8"?>
+<p:properties xmlns:p="http://schemas.microsoft.com/office/2006/metadata/properties" xmlns:xsi="http://www.w3.org/2001/XMLSchema-instance" xmlns:pc="http://schemas.microsoft.com/office/infopath/2007/PartnerControls">
+  <documentManagement>
+    <lcf76f155ced4ddcb4097134ff3c332f xmlns="94d5cf59-5162-48bc-aa9b-620df72947f5">
+      <Terms xmlns="http://schemas.microsoft.com/office/infopath/2007/PartnerControls"/>
+    </lcf76f155ced4ddcb4097134ff3c332f>
+    <TaxCatchAll xmlns="8350b7c0-334b-4e19-bfc1-744f6a979eee" xsi:nil="true"/>
+  </documentManagement>
+</p:properties>
+</file>
+
+<file path=customXml/item4.xml><?xml version="1.0" encoding="utf-8"?>
 <ct:contentTypeSchema xmlns:ct="http://schemas.microsoft.com/office/2006/metadata/contentType" xmlns:ma="http://schemas.microsoft.com/office/2006/metadata/properties/metaAttributes" ct:_="" ma:_="" ma:contentTypeName="Document" ma:contentTypeID="0x01010015F16144C0593A4A82C8AE0B67DB460F" ma:contentTypeVersion="11" ma:contentTypeDescription="Create a new document." ma:contentTypeScope="" ma:versionID="f03428ffc1746d68619392bc270e65d0">
   <xsd:schema xmlns:xsd="http://www.w3.org/2001/XMLSchema" xmlns:xs="http://www.w3.org/2001/XMLSchema" xmlns:p="http://schemas.microsoft.com/office/2006/metadata/properties" xmlns:ns2="94d5cf59-5162-48bc-aa9b-620df72947f5" xmlns:ns3="8350b7c0-334b-4e19-bfc1-744f6a979eee" targetNamespace="http://schemas.microsoft.com/office/2006/metadata/properties" ma:root="true" ma:fieldsID="2206ae29c74f0be434f81d51f34f460d" ns2:_="" ns3:_="">
     <xsd:import namespace="94d5cf59-5162-48bc-aa9b-620df72947f5"/>
@@ -3535,31 +3556,34 @@
 </ct:contentTypeSchema>
 </file>
 
-<file path=customXml/item2.xml><?xml version="1.0" encoding="utf-8"?>
-<p:properties xmlns:p="http://schemas.microsoft.com/office/2006/metadata/properties" xmlns:xsi="http://www.w3.org/2001/XMLSchema-instance" xmlns:pc="http://schemas.microsoft.com/office/infopath/2007/PartnerControls">
-  <documentManagement>
-    <lcf76f155ced4ddcb4097134ff3c332f xmlns="94d5cf59-5162-48bc-aa9b-620df72947f5">
-      <Terms xmlns="http://schemas.microsoft.com/office/infopath/2007/PartnerControls"/>
-    </lcf76f155ced4ddcb4097134ff3c332f>
-    <TaxCatchAll xmlns="8350b7c0-334b-4e19-bfc1-744f6a979eee" xsi:nil="true"/>
-  </documentManagement>
-</p:properties>
+<file path=customXml/itemProps1.xml><?xml version="1.0" encoding="utf-8"?>
+<ds:datastoreItem xmlns:ds="http://schemas.openxmlformats.org/officeDocument/2006/customXml" ds:itemID="{D7CEB92D-E4AC-496B-B8CD-DC145F36CFDD}">
+  <ds:schemaRefs>
+    <ds:schemaRef ds:uri="http://schemas.microsoft.com/sharepoint/v3/contenttype/forms"/>
+  </ds:schemaRefs>
+</ds:datastoreItem>
 </file>
 
-<file path=customXml/item3.xml><?xml version="1.0" encoding="utf-8"?>
-<b:Sources xmlns:b="http://schemas.openxmlformats.org/officeDocument/2006/bibliography" xmlns="http://schemas.openxmlformats.org/officeDocument/2006/bibliography" SelectedStyle="\APASixthEditionOfficeOnline.xsl" StyleName="APA" Version="6"/>
+<file path=customXml/itemProps2.xml><?xml version="1.0" encoding="utf-8"?>
+<ds:datastoreItem xmlns:ds="http://schemas.openxmlformats.org/officeDocument/2006/customXml" ds:itemID="{1B13D280-DAE9-4159-8E27-0B6001C23F99}">
+  <ds:schemaRefs>
+    <ds:schemaRef ds:uri="http://schemas.openxmlformats.org/officeDocument/2006/bibliography"/>
+  </ds:schemaRefs>
+</ds:datastoreItem>
 </file>
 
-<file path=customXml/item4.xml><?xml version="1.0" encoding="utf-8"?>
-<?mso-contentType ?>
-<FormTemplates xmlns="http://schemas.microsoft.com/sharepoint/v3/contenttype/forms">
-  <Display>DocumentLibraryForm</Display>
-  <Edit>DocumentLibraryForm</Edit>
-  <New>DocumentLibraryForm</New>
-</FormTemplates>
+<file path=customXml/itemProps3.xml><?xml version="1.0" encoding="utf-8"?>
+<ds:datastoreItem xmlns:ds="http://schemas.openxmlformats.org/officeDocument/2006/customXml" ds:itemID="{3DC3E886-FAA3-4F9D-BAB3-B7FA9EEB26D5}">
+  <ds:schemaRefs>
+    <ds:schemaRef ds:uri="http://schemas.microsoft.com/office/2006/metadata/properties"/>
+    <ds:schemaRef ds:uri="http://schemas.microsoft.com/office/infopath/2007/PartnerControls"/>
+    <ds:schemaRef ds:uri="94d5cf59-5162-48bc-aa9b-620df72947f5"/>
+    <ds:schemaRef ds:uri="8350b7c0-334b-4e19-bfc1-744f6a979eee"/>
+  </ds:schemaRefs>
+</ds:datastoreItem>
 </file>
 
-<file path=customXml/itemProps1.xml><?xml version="1.0" encoding="utf-8"?>
+<file path=customXml/itemProps4.xml><?xml version="1.0" encoding="utf-8"?>
 <ds:datastoreItem xmlns:ds="http://schemas.openxmlformats.org/officeDocument/2006/customXml" ds:itemID="{C4741666-369F-4F81-99B9-33314B90D955}">
   <ds:schemaRefs>
     <ds:schemaRef ds:uri="http://schemas.microsoft.com/office/2006/metadata/contentType"/>
@@ -3578,33 +3602,6 @@
 </ds:datastoreItem>
 </file>
 
-<file path=customXml/itemProps2.xml><?xml version="1.0" encoding="utf-8"?>
-<ds:datastoreItem xmlns:ds="http://schemas.openxmlformats.org/officeDocument/2006/customXml" ds:itemID="{3DC3E886-FAA3-4F9D-BAB3-B7FA9EEB26D5}">
-  <ds:schemaRefs>
-    <ds:schemaRef ds:uri="http://schemas.microsoft.com/office/2006/metadata/properties"/>
-    <ds:schemaRef ds:uri="http://schemas.microsoft.com/office/infopath/2007/PartnerControls"/>
-    <ds:schemaRef ds:uri="94d5cf59-5162-48bc-aa9b-620df72947f5"/>
-    <ds:schemaRef ds:uri="8350b7c0-334b-4e19-bfc1-744f6a979eee"/>
-  </ds:schemaRefs>
-</ds:datastoreItem>
-</file>
-
-<file path=customXml/itemProps3.xml><?xml version="1.0" encoding="utf-8"?>
-<ds:datastoreItem xmlns:ds="http://schemas.openxmlformats.org/officeDocument/2006/customXml" ds:itemID="{1B13D280-DAE9-4159-8E27-0B6001C23F99}">
-  <ds:schemaRefs>
-    <ds:schemaRef ds:uri="http://schemas.openxmlformats.org/officeDocument/2006/bibliography"/>
-  </ds:schemaRefs>
-</ds:datastoreItem>
-</file>
-
-<file path=customXml/itemProps4.xml><?xml version="1.0" encoding="utf-8"?>
-<ds:datastoreItem xmlns:ds="http://schemas.openxmlformats.org/officeDocument/2006/customXml" ds:itemID="{D7CEB92D-E4AC-496B-B8CD-DC145F36CFDD}">
-  <ds:schemaRefs>
-    <ds:schemaRef ds:uri="http://schemas.microsoft.com/sharepoint/v3/contenttype/forms"/>
-  </ds:schemaRefs>
-</ds:datastoreItem>
-</file>
-
 <file path=docMetadata/LabelInfo.xml><?xml version="1.0" encoding="utf-8"?>
 <clbl:labelList xmlns:clbl="http://schemas.microsoft.com/office/2020/mipLabelMetadata">
   <clbl:label id="{e0793d39-0939-496d-b129-198edd916feb}" enabled="0" method="" siteId="{e0793d39-0939-496d-b129-198edd916feb}" removed="1"/>

</xml_diff>